<commit_message>
Review fixes: copied-span metrics, two-panel Figure 2, prompt style separation, CPU time, PDF font with full Unicode
</commit_message>
<xml_diff>
--- a/Generative_AI_Analysis_Report.docx
+++ b/Generative_AI_Analysis_Report.docx
@@ -290,7 +290,7 @@
         <w:rPr>
           <w:b w:val="0"/>
         </w:rPr>
-        <w:t>The training curves (Figure 1) show that pre-training converged smoothly, with training and validation loss close together. Fine-tuning lowered the validation loss on Psalms and Proverbs from 0.9479 to 0.9283 in only 75 steps, after which it rose steadily to 0.9555 at step 600 while the training loss kept falling to 0.6209: a clear case of overfitting to a small corpus that early stopping avoided. Because generated text has no single correct answer, the outputs were evaluated both by reading them and with simple automatic diagnostics computed on 150 generated verses per setting (Figure 2 and Figure 3): the share of generated words that never occur in the Bible, the share of generated six-word sequences found verbatim in the training text, and distinct-2, the ratio of unique to total word pairs, a standard measure of repetition in generated text (Li et al., 2016). The temperature, which rescales the model's probabilities before sampling, controls the trade-off between repetitive and incoherent text (Holtzman et al., 2020).</w:t>
+        <w:t>The training curves (Figure 1) show that pre-training converged smoothly, with training and validation loss close together. Fine-tuning lowered the validation loss on Psalms and Proverbs from 0.9479 to 0.9283 in only 75 steps, after which it rose steadily to 0.9555 at step 600 while the training loss kept falling to 0.6209: a clear case of overfitting to a small corpus that early stopping avoided. Because generated text has no single correct answer, the outputs were evaluated both by reading them and with simple automatic diagnostics computed on 150 generated verses per setting (Figure 2 and Figure 3): the share of generated words that never occur in the Bible, the share of generated six-word sequences found verbatim in the training text, the share of verses containing a copied span of six or more words, and distinct-2, the ratio of unique to total word pairs, a standard measure of repetition in generated text (Li et al., 2016). The temperature, which rescales the model's probabilities before sampling, controls the trade-off between repetitive and incoherent text (Holtzman et al., 2020).</w:t>
       </w:r>
     </w:p>
     <w:p>
@@ -302,7 +302,7 @@
         <w:rPr>
           <w:b w:val="0"/>
         </w:rPr>
-        <w:t>Fine-tuning changed the style, not only the loss. With the same prompts and random seeds, the pre-trained-only model wrote narrative or prophetic lines, such as "Y acontecerá que como los siervos de Adullam invocan á ellos, dice Jehová", while the fine-tuned model adopted the first-person, prayer-like voice of the Psalms ("Porque yo he alegrado en tu socorro; júbilo en tu generación, y en tu buena guarda mi alma") and the address formula of Proverbs ("Oye, hijo mío, amigo mío"). The median length of generated verses moved from 95 characters to 76, close to the 79 characters of real Psalms and Proverbs. The strengths are formal: the model reproduces the 1909 spelling, the colon-and-semicolon structure of Hebrew parallelism and the antithetic parallelism of Proverbs introduced by mas ("mas el que se encubre la palabra, será cortado"). At temperature 0.8, only 1.9 % of its words are invented and its distinct-2 score (0.720) is close to that of real held-out verses (0.728). It also does not recite scripture: only 0.6 % of its six-word sequences appear verbatim in the training text, fewer than the 2.2 % that real held-out verses share with the training text through formulaic phrases.</w:t>
+        <w:t>Fine-tuning changed the style, not only the loss. With the same prompts and random seeds, the pre-trained-only model wrote narrative or prophetic lines, such as "Y acontecerá que como los siervos de Adullam invocan á ellos, dice Jehová", while the fine-tuned model adopted the first-person, prayer-like voice of the Psalms ("Porque yo he alegrado en tu socorro; júbilo en tu generación, y en tu buena guarda mi alma") and the address formula of Proverbs ("Oye, hijo mío, amigo mío"). The median length of generated verses moved from 95 characters to 76, close to the 79 characters of real Psalms and Proverbs. The strengths are formal: the model reproduces the 1909 spelling, the colon-and-semicolon structure of Hebrew parallelism and the antithetic parallelism of Proverbs introduced by mas ("mas el que se encubre la palabra, será cortado"). At temperature 0.8, only 1.9 % of its words are invented and its distinct-2 score (0.720) is close to that of real held-out verses (0.728). It also does not recite scripture: only 0.6 % of its six-word sequences appear verbatim in the training text and only 3.3 % of its verses contain a copied span of six or more words, fewer than real held-out verses (2.2 % of six-word sequences and 9.9 % of verses), which share formulaic phrases with other chapters. The book prompt separates the two styles in a measurable way: the Proverbs conjunction mas appears in 17.0 % of the verses generated with PRO: against 4.7 % with PSA: (24.9 % and 3.7 % in the real books), and Selah, which exists only in the Psalms, appears in 3.3 % of PSA: verses against 0.3 % of PRO: verses; the separation is not perfect, since one PSA: sample began with the Proverbs formula "HIJO mío".</w:t>
       </w:r>
     </w:p>
     <w:p>
@@ -314,7 +314,7 @@
         <w:rPr>
           <w:b w:val="0"/>
         </w:rPr>
-        <w:t>The failure cases are just as clear. Most lines are grammatical but meaningless as a whole ("Porque Jehová es al malo en mi afrenta, y para sus saludes"), because a character-level model learns local patterns, not meaning. At temperature 0.5 the model falls into loops ("El hijo sabio del hombre sabio es el hombre sabio"), its distinct-2 drops to 0.526 and copying rises to 4.1 %, with a longest copied span of 10 words; the overfitted model also repeats the refrain of Psalm 136 within a single line. At temperature 1.3, 11 % of the words are invented ("encruelto", "juzgadoría") and formatting breaks. The most important failure is not technical: at temperature 0.5 the model produced "Y en Israel respondió: No hay Dios en toda la tierra", a statement that contradicts the text it was trained on but is written in a perfectly scriptural register. Temperature 0.8 gave the best balance, and the fine-tuned, early-stopped model was the best of the three models compared.</w:t>
+        <w:t>The failure cases are just as clear. Most lines are grammatical but meaningless as a whole ("Porque Jehová es al malo en mi afrenta, y para sus saludes"), because a character-level model learns local patterns, not meaning. At temperature 0.5 the model falls into loops ("El hijo sabio del hombre sabio es el hombre sabio"), its distinct-2 drops to 0.526 and copying rises to 4.1 % of six-word sequences and 23.3 % of verses, with a longest copied span of 10 words; the overfitted model also repeats the refrain of Psalm 136 within a single line. At temperature 1.3, 11 % of the words are invented ("encruelto", "juzgadoría") and formatting breaks. The most important failure is not technical: at temperature 0.5 the model produced "Y en Israel respondió: No hay Dios en toda la tierra", a statement that contradicts the text it was trained on but is written in a perfectly scriptural register. Temperature 0.8 gave the best balance. Among the three models, the early-stopped fine-tuned model had the most realistic length and diversity and the least copying (3.3 % of verses, against 6.7 % for the pre-trained model and 9.3 % for the overfitted one), although its invented-word rate (0.019) was slightly higher than that of the other two (0.016).</w:t>
       </w:r>
     </w:p>
     <w:p>
@@ -350,7 +350,7 @@
       <w:r>
         <w:drawing>
           <wp:inline xmlns:a="http://schemas.openxmlformats.org/drawingml/2006/main" xmlns:pic="http://schemas.openxmlformats.org/drawingml/2006/picture">
-            <wp:extent cx="5760720" cy="3149309"/>
+            <wp:extent cx="5760720" cy="2044931"/>
             <wp:docPr id="2" name="Picture 2"/>
             <wp:cNvGraphicFramePr>
               <a:graphicFrameLocks noChangeAspect="1"/>
@@ -371,7 +371,7 @@
                   <pic:spPr>
                     <a:xfrm>
                       <a:off x="0" y="0"/>
-                      <a:ext cx="5760720" cy="3149309"/>
+                      <a:ext cx="5760720" cy="2044931"/>
                     </a:xfrm>
                     <a:prstGeom prst="rect"/>
                   </pic:spPr>
@@ -389,7 +389,7 @@
       </w:pPr>
       <w:r>
         <w:rPr/>
-        <w:t>Note. 150 verses generated per temperature by the early-stopped fine-tuned model; dotted lines are real held-out verses.</w:t>
+        <w:t>Note. 150 verses generated per temperature by the early-stopped fine-tuned model; left panel: invented words and copying, right panel: repetition; dotted lines are real held-out verses.</w:t>
       </w:r>
     </w:p>
     <w:p>

</xml_diff>